<commit_message>
add tex as new way to write my CV
</commit_message>
<xml_diff>
--- a/CV EL BACHIR_fr.docx
+++ b/CV EL BACHIR_fr.docx
@@ -101,7 +101,7 @@
                                       <w:sz w:val="56"/>
                                     </w:rPr>
                                     <w:alias w:val="Titre"/>
-                                    <w:id w:val="1346987194"/>
+                                    <w:id w:val="-1392193923"/>
                                     <w:dataBinding w:prefixMappings="xmlns:ns0='http://schemas.openxmlformats.org/package/2006/metadata/core-properties' xmlns:ns1='http://purl.org/dc/elements/1.1/'" w:xpath="/ns0:coreProperties[1]/ns1:title[1]" w:storeItemID="{6C3C8BC8-F283-45AE-878A-BAB7291924A1}"/>
                                     <w:text/>
                                   </w:sdtPr>
@@ -155,7 +155,7 @@
                                 <w:sz w:val="56"/>
                               </w:rPr>
                               <w:alias w:val="Titre"/>
-                              <w:id w:val="586504334"/>
+                              <w:id w:val="-1392193923"/>
                               <w:dataBinding w:prefixMappings="xmlns:ns0='http://schemas.openxmlformats.org/package/2006/metadata/core-properties' xmlns:ns1='http://purl.org/dc/elements/1.1/'" w:xpath="/ns0:coreProperties[1]/ns1:title[1]" w:storeItemID="{6C3C8BC8-F283-45AE-878A-BAB7291924A1}"/>
                               <w:text/>
                             </w:sdtPr>
@@ -254,7 +254,7 @@
                                 <w:sdt>
                                   <w:sdtPr>
                                     <w:alias w:val="Sous-titre"/>
-                                    <w:id w:val="-1790127783"/>
+                                    <w:id w:val="-44382106"/>
                                     <w:dataBinding w:prefixMappings="xmlns:ns0='http://schemas.openxmlformats.org/package/2006/metadata/core-properties' xmlns:ns1='http://purl.org/dc/elements/1.1/'" w:xpath="/ns0:coreProperties[1]/ns1:subject[1]" w:storeItemID="{6C3C8BC8-F283-45AE-878A-BAB7291924A1}"/>
                                     <w:text/>
                                   </w:sdtPr>
@@ -295,7 +295,7 @@
                           <w:sdt>
                             <w:sdtPr>
                               <w:alias w:val="Sous-titre"/>
-                              <w:id w:val="-1914078485"/>
+                              <w:id w:val="-44382106"/>
                               <w:dataBinding w:prefixMappings="xmlns:ns0='http://schemas.openxmlformats.org/package/2006/metadata/core-properties' xmlns:ns1='http://purl.org/dc/elements/1.1/'" w:xpath="/ns0:coreProperties[1]/ns1:subject[1]" w:storeItemID="{6C3C8BC8-F283-45AE-878A-BAB7291924A1}"/>
                               <w:text/>
                             </w:sdtPr>
@@ -898,7 +898,7 @@
                         <w:rPr>
                           <w:rStyle w:val="fontstyle01"/>
                         </w:rPr>
-                        <w:t xml:space="preserve">En thèse de </w:t>
+                        <w:t xml:space="preserve">Obtenu un </w:t>
                       </w:r>
                       <w:r>
                         <w:rPr>
@@ -1066,6 +1066,15 @@
                           <w:color w:val="595959" w:themeColor="text1" w:themeTint="A6"/>
                         </w:rPr>
                         <w:t>’’</w:t>
+                      </w:r>
+                      <w:r>
+                        <w:rPr>
+                          <w:rStyle w:val="fontstyle21"/>
+                          <w:b/>
+                          <w:bCs/>
+                          <w:color w:val="595959" w:themeColor="text1" w:themeTint="A6"/>
+                        </w:rPr>
+                        <w:t xml:space="preserve"> (mention très bien)</w:t>
                       </w:r>
                     </w:p>
                     <w:p>
@@ -1586,7 +1595,6 @@
                     <w:rStyle w:val="fontstyle01"/>
                     <w:color w:val="C00000"/>
                   </w:rPr>
-                  <w:lastRenderedPageBreak/>
                   <w:t>Mes compétences</w:t>
                 </w:r>
               </w:p>
@@ -1761,6 +1769,155 @@
                         <w:t>AstroJS</w:t>
                       </w:r>
                       <w:proofErr w:type="spellEnd"/>
+                      <w:r>
+                        <w:rPr>
+                          <w:rFonts w:ascii="Century Gothic" w:eastAsia="Times New Roman" w:hAnsi="Century Gothic" w:cs="Times New Roman"/>
+                          <w:color w:val="000000"/>
+                          <w:sz w:val="28"/>
+                          <w:szCs w:val="28"/>
+                          <w:lang w:val="en-US"/>
+                        </w:rPr>
+                        <w:t>, React Native</w:t>
+                      </w:r>
+                      <w:r>
+                        <w:rPr>
+                          <w:rFonts w:ascii="Century Gothic" w:eastAsia="Times New Roman" w:hAnsi="Century Gothic" w:cs="Times New Roman"/>
+                          <w:color w:val="000000"/>
+                          <w:sz w:val="28"/>
+                          <w:szCs w:val="28"/>
+                          <w:lang w:val="en-US"/>
+                        </w:rPr>
+                        <w:t>);</w:t>
+                      </w:r>
+                    </w:p>
+                    <w:p>
+                      <w:pPr>
+                        <w:pStyle w:val="Paragraphedeliste"/>
+                        <w:numPr>
+                          <w:ilvl w:val="0"/>
+                          <w:numId w:val="4"/>
+                        </w:numPr>
+                        <w:spacing w:after="0" w:line="240" w:lineRule="auto"/>
+                        <w:ind w:left="363" w:hanging="363"/>
+                        <w:jc w:val="both"/>
+                        <w:rPr>
+                          <w:rFonts w:ascii="Century Gothic" w:eastAsia="Times New Roman" w:hAnsi="Century Gothic" w:cs="Times New Roman"/>
+                          <w:color w:val="000000"/>
+                          <w:sz w:val="28"/>
+                          <w:szCs w:val="28"/>
+                          <w:lang w:val="en-US"/>
+                        </w:rPr>
+                      </w:pPr>
+                      <w:r>
+                        <w:rPr>
+                          <w:rFonts w:ascii="Century Gothic" w:eastAsia="Times New Roman" w:hAnsi="Century Gothic" w:cs="Times New Roman"/>
+                          <w:b/>
+                          <w:bCs/>
+                          <w:color w:val="C00000"/>
+                          <w:sz w:val="28"/>
+                          <w:szCs w:val="28"/>
+                          <w:lang w:val="en-US"/>
+                        </w:rPr>
+                        <w:t xml:space="preserve">Backend development </w:t>
+                      </w:r>
+                      <w:r>
+                        <w:rPr>
+                          <w:rFonts w:ascii="Century Gothic" w:eastAsia="Times New Roman" w:hAnsi="Century Gothic" w:cs="Times New Roman"/>
+                          <w:color w:val="000000"/>
+                          <w:sz w:val="28"/>
+                          <w:szCs w:val="28"/>
+                          <w:lang w:val="en-US"/>
+                        </w:rPr>
+                        <w:t>(</w:t>
+                      </w:r>
+                      <w:proofErr w:type="spellStart"/>
+                      <w:r>
+                        <w:rPr>
+                          <w:rFonts w:ascii="Century Gothic" w:eastAsia="Times New Roman" w:hAnsi="Century Gothic" w:cs="Times New Roman"/>
+                          <w:color w:val="000000"/>
+                          <w:sz w:val="28"/>
+                          <w:szCs w:val="28"/>
+                          <w:lang w:val="en-US"/>
+                        </w:rPr>
+                        <w:t>ReactJS</w:t>
+                      </w:r>
+                      <w:proofErr w:type="spellEnd"/>
+                      <w:r>
+                        <w:rPr>
+                          <w:rFonts w:ascii="Century Gothic" w:eastAsia="Times New Roman" w:hAnsi="Century Gothic" w:cs="Times New Roman"/>
+                          <w:color w:val="000000"/>
+                          <w:sz w:val="28"/>
+                          <w:szCs w:val="28"/>
+                          <w:lang w:val="en-US"/>
+                        </w:rPr>
+                        <w:t xml:space="preserve">, Styled Components, Sass, </w:t>
+                      </w:r>
+                      <w:proofErr w:type="spellStart"/>
+                      <w:r>
+                        <w:rPr>
+                          <w:rFonts w:ascii="Century Gothic" w:eastAsia="Times New Roman" w:hAnsi="Century Gothic" w:cs="Times New Roman"/>
+                          <w:color w:val="000000"/>
+                          <w:sz w:val="28"/>
+                          <w:szCs w:val="28"/>
+                          <w:lang w:val="en-US"/>
+                        </w:rPr>
+                        <w:t>TailwindCSS</w:t>
+                      </w:r>
+                      <w:proofErr w:type="spellEnd"/>
+                      <w:r>
+                        <w:rPr>
+                          <w:rFonts w:ascii="Century Gothic" w:eastAsia="Times New Roman" w:hAnsi="Century Gothic" w:cs="Times New Roman"/>
+                          <w:color w:val="000000"/>
+                          <w:sz w:val="28"/>
+                          <w:szCs w:val="28"/>
+                          <w:lang w:val="en-US"/>
+                        </w:rPr>
+                        <w:t xml:space="preserve">, </w:t>
+                      </w:r>
+                      <w:proofErr w:type="spellStart"/>
+                      <w:r>
+                        <w:rPr>
+                          <w:rFonts w:ascii="Century Gothic" w:eastAsia="Times New Roman" w:hAnsi="Century Gothic" w:cs="Times New Roman"/>
+                          <w:color w:val="000000"/>
+                          <w:sz w:val="28"/>
+                          <w:szCs w:val="28"/>
+                          <w:lang w:val="en-US"/>
+                        </w:rPr>
+                        <w:t>NextJS</w:t>
+                      </w:r>
+                      <w:proofErr w:type="spellEnd"/>
+                      <w:r>
+                        <w:rPr>
+                          <w:rFonts w:ascii="Century Gothic" w:eastAsia="Times New Roman" w:hAnsi="Century Gothic" w:cs="Times New Roman"/>
+                          <w:color w:val="000000"/>
+                          <w:sz w:val="28"/>
+                          <w:szCs w:val="28"/>
+                          <w:lang w:val="en-US"/>
+                        </w:rPr>
+                        <w:t xml:space="preserve">, </w:t>
+                      </w:r>
+                      <w:proofErr w:type="spellStart"/>
+                      <w:r>
+                        <w:rPr>
+                          <w:rFonts w:ascii="Century Gothic" w:eastAsia="Times New Roman" w:hAnsi="Century Gothic" w:cs="Times New Roman"/>
+                          <w:color w:val="000000"/>
+                          <w:sz w:val="28"/>
+                          <w:szCs w:val="28"/>
+                          <w:lang w:val="en-US"/>
+                        </w:rPr>
+                        <w:t>AstroJS</w:t>
+                      </w:r>
+                      <w:proofErr w:type="spellEnd"/>
+                      <w:r>
+                        <w:rPr>
+                          <w:rFonts w:ascii="Century Gothic" w:eastAsia="Times New Roman" w:hAnsi="Century Gothic" w:cs="Times New Roman"/>
+                          <w:color w:val="000000"/>
+                          <w:sz w:val="28"/>
+                          <w:szCs w:val="28"/>
+                          <w:lang w:val="en-US"/>
+                        </w:rPr>
+                        <w:t>, React Native</w:t>
+                      </w:r>
                       <w:r>
                         <w:rPr>
                           <w:rFonts w:ascii="Century Gothic" w:eastAsia="Times New Roman" w:hAnsi="Century Gothic" w:cs="Times New Roman"/>
@@ -2556,7 +2713,27 @@
                           <w:szCs w:val="28"/>
                           <w:lang w:val="en-US"/>
                         </w:rPr>
-                        <w:t>ERN stack</w:t>
+                        <w:t>ERN</w:t>
+                      </w:r>
+                      <w:r>
+                        <w:rPr>
+                          <w:rFonts w:ascii="Century Gothic" w:eastAsia="Times New Roman" w:hAnsi="Century Gothic" w:cs="Times New Roman"/>
+                          <w:b/>
+                          <w:sz w:val="28"/>
+                          <w:szCs w:val="28"/>
+                          <w:lang w:val="en-US"/>
+                        </w:rPr>
+                        <w:t xml:space="preserve"> (Mongo Express React Node)</w:t>
+                      </w:r>
+                      <w:r>
+                        <w:rPr>
+                          <w:rFonts w:ascii="Century Gothic" w:eastAsia="Times New Roman" w:hAnsi="Century Gothic" w:cs="Times New Roman"/>
+                          <w:b/>
+                          <w:sz w:val="28"/>
+                          <w:szCs w:val="28"/>
+                          <w:lang w:val="en-US"/>
+                        </w:rPr>
+                        <w:t xml:space="preserve"> stack</w:t>
                       </w:r>
                       <w:r>
                         <w:rPr>
@@ -2673,6 +2850,82 @@
                           <w:lang w:val="en-US"/>
                         </w:rPr>
                         <w:t>)</w:t>
+                      </w:r>
+                    </w:p>
+                    <w:p>
+                      <w:pPr>
+                        <w:pStyle w:val="Paragraphedeliste"/>
+                        <w:numPr>
+                          <w:ilvl w:val="0"/>
+                          <w:numId w:val="7"/>
+                        </w:numPr>
+                        <w:spacing w:after="0" w:line="240" w:lineRule="auto"/>
+                        <w:ind w:left="351" w:hanging="351"/>
+                        <w:rPr>
+                          <w:rFonts w:ascii="Century Gothic" w:eastAsia="Times New Roman" w:hAnsi="Century Gothic" w:cs="Times New Roman"/>
+                          <w:b/>
+                          <w:sz w:val="28"/>
+                          <w:szCs w:val="28"/>
+                          <w:lang w:val="en-US"/>
+                        </w:rPr>
+                      </w:pPr>
+                      <w:r>
+                        <w:rPr>
+                          <w:rFonts w:ascii="Century Gothic" w:eastAsia="Times New Roman" w:hAnsi="Century Gothic" w:cs="Times New Roman"/>
+                          <w:b/>
+                          <w:sz w:val="28"/>
+                          <w:szCs w:val="28"/>
+                          <w:lang w:val="en-US"/>
+                        </w:rPr>
+                        <w:t xml:space="preserve">CITS ( </w:t>
+                      </w:r>
+                      <w:r>
+                        <w:rPr>
+                          <w:rFonts w:ascii="Century Gothic" w:eastAsia="Times New Roman" w:hAnsi="Century Gothic" w:cs="Times New Roman"/>
+                          <w:sz w:val="28"/>
+                          <w:szCs w:val="28"/>
+                          <w:lang w:val="en-US"/>
+                        </w:rPr>
+                        <w:t xml:space="preserve">Cameroonian tech summit </w:t>
+                      </w:r>
+                      <w:r>
+                        <w:rPr>
+                          <w:rFonts w:ascii="Century Gothic" w:eastAsia="Times New Roman" w:hAnsi="Century Gothic" w:cs="Times New Roman"/>
+                          <w:b/>
+                          <w:sz w:val="28"/>
+                          <w:szCs w:val="28"/>
+                          <w:lang w:val="en-US"/>
+                        </w:rPr>
+                        <w:t xml:space="preserve">) </w:t>
+                      </w:r>
+                      <w:r>
+                        <w:rPr>
+                          <w:rFonts w:ascii="Century Gothic" w:eastAsia="Times New Roman" w:hAnsi="Century Gothic" w:cs="Times New Roman"/>
+                          <w:sz w:val="28"/>
+                          <w:szCs w:val="28"/>
+                          <w:lang w:val="en-US"/>
+                        </w:rPr>
+                        <w:t xml:space="preserve">: Cameroon national </w:t>
+                      </w:r>
+                      <w:proofErr w:type="spellStart"/>
+                      <w:r>
+                        <w:rPr>
+                          <w:rFonts w:ascii="Century Gothic" w:eastAsia="Times New Roman" w:hAnsi="Century Gothic" w:cs="Times New Roman"/>
+                          <w:sz w:val="28"/>
+                          <w:szCs w:val="28"/>
+                          <w:lang w:val="en-US"/>
+                        </w:rPr>
+                        <w:t>hackhaton</w:t>
+                      </w:r>
+                      <w:proofErr w:type="spellEnd"/>
+                      <w:r>
+                        <w:rPr>
+                          <w:rFonts w:ascii="Century Gothic" w:eastAsia="Times New Roman" w:hAnsi="Century Gothic" w:cs="Times New Roman"/>
+                          <w:sz w:val="28"/>
+                          <w:szCs w:val="28"/>
+                          <w:lang w:val="en-US"/>
+                        </w:rPr>
+                        <w:t xml:space="preserve"> participant</w:t>
                       </w:r>
                     </w:p>
                     <w:p>
@@ -2892,7 +3145,7 @@
             <w:tblLook w:val="04A0" w:firstRow="1" w:lastRow="0" w:firstColumn="1" w:lastColumn="0" w:noHBand="0" w:noVBand="1"/>
           </w:tblPr>
           <w:tblGrid>
-            <w:gridCol w:w="9807"/>
+            <w:gridCol w:w="9802"/>
           </w:tblGrid>
           <w:tr>
             <w:tc>
@@ -2924,8 +3177,8 @@
               <w:tcPr>
                 <w:tcW w:w="9797" w:type="dxa"/>
                 <w:tcBorders>
-                  <w:top w:val="single" w:sz="18" w:space="0" w:color="auto"/>
-                  <w:left w:val="nil"/>
+                  <w:top w:val="single" w:sz="4" w:space="0" w:color="FFFFFF" w:themeColor="background1"/>
+                  <w:left w:val="single" w:sz="4" w:space="0" w:color="FFFFFF" w:themeColor="background1"/>
                   <w:bottom w:val="nil"/>
                   <w:right w:val="nil"/>
                 </w:tcBorders>
@@ -3109,22 +3362,14 @@
                         </w:rPr>
                         <w:t>, C++</w:t>
                       </w:r>
-                      <w:r>
-                        <w:rPr>
-                          <w:rFonts w:ascii="Century Gothic" w:eastAsia="Times New Roman" w:hAnsi="Century Gothic" w:cs="Times New Roman"/>
-                          <w:color w:val="000000"/>
-                          <w:sz w:val="28"/>
-                          <w:szCs w:val="28"/>
-                        </w:rPr>
-                        <w:t xml:space="preserve">. </w:t>
-                      </w:r>
                     </w:p>
                     <w:p>
                       <w:pPr>
                         <w:spacing w:line="240" w:lineRule="auto"/>
                         <w:rPr>
-                          <w:rFonts w:ascii="Century Gothic" w:eastAsia="Times New Roman" w:hAnsi="Century Gothic" w:cs="Times New Roman"/>
-                          <w:color w:val="000000"/>
+                          <w:rStyle w:val="Lienhypertexte"/>
+                          <w:rFonts w:ascii="Century Gothic" w:eastAsia="Times New Roman" w:hAnsi="Century Gothic" w:cs="Times New Roman"/>
+                          <w:color w:val="C00000"/>
                           <w:sz w:val="28"/>
                           <w:szCs w:val="28"/>
                         </w:rPr>
@@ -3167,6 +3412,191 @@
                           <w:ilvl w:val="0"/>
                           <w:numId w:val="6"/>
                         </w:numPr>
+                        <w:spacing w:line="240" w:lineRule="auto"/>
+                        <w:ind w:left="635" w:hanging="635"/>
+                        <w:rPr>
+                          <w:rFonts w:ascii="Century Gothic" w:eastAsia="Times New Roman" w:hAnsi="Century Gothic" w:cs="Times New Roman"/>
+                          <w:color w:val="C00000"/>
+                          <w:sz w:val="28"/>
+                          <w:szCs w:val="28"/>
+                        </w:rPr>
+                      </w:pPr>
+                      <w:proofErr w:type="spellStart"/>
+                      <w:r>
+                        <w:rPr>
+                          <w:rFonts w:ascii="Century Gothic" w:eastAsia="Times New Roman" w:hAnsi="Century Gothic" w:cs="Times New Roman"/>
+                          <w:b/>
+                          <w:color w:val="C00000"/>
+                          <w:sz w:val="28"/>
+                          <w:szCs w:val="28"/>
+                        </w:rPr>
+                        <w:t>Chairental</w:t>
+                      </w:r>
+                      <w:proofErr w:type="spellEnd"/>
+                      <w:r>
+                        <w:rPr>
+                          <w:rFonts w:ascii="Century Gothic" w:eastAsia="Times New Roman" w:hAnsi="Century Gothic" w:cs="Times New Roman"/>
+                          <w:b/>
+                          <w:color w:val="C00000"/>
+                          <w:sz w:val="28"/>
+                          <w:szCs w:val="28"/>
+                        </w:rPr>
+                        <w:t> :</w:t>
+                      </w:r>
+                      <w:r>
+                        <w:rPr>
+                          <w:rFonts w:ascii="Century Gothic" w:eastAsia="Times New Roman" w:hAnsi="Century Gothic" w:cs="Times New Roman"/>
+                          <w:b/>
+                          <w:color w:val="C00000"/>
+                          <w:sz w:val="28"/>
+                          <w:szCs w:val="28"/>
+                        </w:rPr>
+                        <w:t xml:space="preserve"> </w:t>
+                      </w:r>
+                      <w:r>
+                        <w:rPr>
+                          <w:rFonts w:ascii="Century Gothic" w:eastAsia="Times New Roman" w:hAnsi="Century Gothic" w:cs="Times New Roman"/>
+                          <w:sz w:val="28"/>
+                          <w:szCs w:val="28"/>
+                        </w:rPr>
+                        <w:t>un</w:t>
+                      </w:r>
+                      <w:r>
+                        <w:rPr>
+                          <w:rFonts w:ascii="Century Gothic" w:eastAsia="Times New Roman" w:hAnsi="Century Gothic" w:cs="Times New Roman"/>
+                          <w:sz w:val="28"/>
+                          <w:szCs w:val="28"/>
+                        </w:rPr>
+                        <w:t xml:space="preserve"> site e-commerce dans le style </w:t>
+                      </w:r>
+                      <w:proofErr w:type="spellStart"/>
+                      <w:r>
+                        <w:rPr>
+                          <w:rFonts w:ascii="Century Gothic" w:eastAsia="Times New Roman" w:hAnsi="Century Gothic" w:cs="Times New Roman"/>
+                          <w:sz w:val="28"/>
+                          <w:szCs w:val="28"/>
+                        </w:rPr>
+                        <w:t>ali</w:t>
+                      </w:r>
+                      <w:proofErr w:type="spellEnd"/>
+                      <w:r>
+                        <w:rPr>
+                          <w:rFonts w:ascii="Century Gothic" w:eastAsia="Times New Roman" w:hAnsi="Century Gothic" w:cs="Times New Roman"/>
+                          <w:sz w:val="28"/>
+                          <w:szCs w:val="28"/>
+                        </w:rPr>
+                        <w:t xml:space="preserve"> baba (en cours): </w:t>
+                      </w:r>
+                      <w:r>
+                        <w:rPr>
+                          <w:rFonts w:ascii="Century Gothic" w:eastAsia="Times New Roman" w:hAnsi="Century Gothic" w:cs="Times New Roman"/>
+                          <w:sz w:val="28"/>
+                          <w:szCs w:val="28"/>
+                        </w:rPr>
+                        <w:br/>
+                        <w:t>- gestion de panier</w:t>
+                      </w:r>
+                      <w:r>
+                        <w:rPr>
+                          <w:rFonts w:ascii="Century Gothic" w:eastAsia="Times New Roman" w:hAnsi="Century Gothic" w:cs="Times New Roman"/>
+                          <w:sz w:val="28"/>
+                          <w:szCs w:val="28"/>
+                        </w:rPr>
+                        <w:br/>
+                        <w:t xml:space="preserve">- gestion de </w:t>
+                      </w:r>
+                      <w:proofErr w:type="spellStart"/>
+                      <w:r>
+                        <w:rPr>
+                          <w:rFonts w:ascii="Century Gothic" w:eastAsia="Times New Roman" w:hAnsi="Century Gothic" w:cs="Times New Roman"/>
+                          <w:sz w:val="28"/>
+                          <w:szCs w:val="28"/>
+                        </w:rPr>
+                        <w:t>track</w:t>
+                      </w:r>
+                      <w:proofErr w:type="spellEnd"/>
+                      <w:r>
+                        <w:rPr>
+                          <w:rFonts w:ascii="Century Gothic" w:eastAsia="Times New Roman" w:hAnsi="Century Gothic" w:cs="Times New Roman"/>
+                          <w:sz w:val="28"/>
+                          <w:szCs w:val="28"/>
+                        </w:rPr>
+                        <w:t xml:space="preserve"> produit</w:t>
+                      </w:r>
+                      <w:r>
+                        <w:rPr>
+                          <w:rFonts w:ascii="Century Gothic" w:eastAsia="Times New Roman" w:hAnsi="Century Gothic" w:cs="Times New Roman"/>
+                          <w:sz w:val="28"/>
+                          <w:szCs w:val="28"/>
+                        </w:rPr>
+                        <w:br/>
+                        <w:t>-</w:t>
+                      </w:r>
+                      <w:r>
+                        <w:rPr>
+                          <w:rFonts w:ascii="Century Gothic" w:eastAsia="Times New Roman" w:hAnsi="Century Gothic" w:cs="Times New Roman"/>
+                          <w:color w:val="C00000"/>
+                          <w:sz w:val="28"/>
+                          <w:szCs w:val="28"/>
+                        </w:rPr>
+                        <w:t xml:space="preserve"> </w:t>
+                      </w:r>
+                      <w:proofErr w:type="spellStart"/>
+                      <w:r>
+                        <w:rPr>
+                          <w:rFonts w:ascii="Century Gothic" w:eastAsia="Times New Roman" w:hAnsi="Century Gothic" w:cs="Times New Roman"/>
+                          <w:sz w:val="28"/>
+                          <w:szCs w:val="28"/>
+                        </w:rPr>
+                        <w:t>dashboard</w:t>
+                      </w:r>
+                      <w:proofErr w:type="spellEnd"/>
+                      <w:r>
+                        <w:rPr>
+                          <w:rFonts w:ascii="Century Gothic" w:eastAsia="Times New Roman" w:hAnsi="Century Gothic" w:cs="Times New Roman"/>
+                          <w:sz w:val="28"/>
+                          <w:szCs w:val="28"/>
+                        </w:rPr>
+                        <w:t xml:space="preserve"> </w:t>
+                      </w:r>
+                      <w:proofErr w:type="spellStart"/>
+                      <w:r>
+                        <w:rPr>
+                          <w:rFonts w:ascii="Century Gothic" w:eastAsia="Times New Roman" w:hAnsi="Century Gothic" w:cs="Times New Roman"/>
+                          <w:sz w:val="28"/>
+                          <w:szCs w:val="28"/>
+                        </w:rPr>
+                        <w:t>admin</w:t>
+                      </w:r>
+                      <w:proofErr w:type="spellEnd"/>
+                      <w:r>
+                        <w:rPr>
+                          <w:rFonts w:ascii="Century Gothic" w:eastAsia="Times New Roman" w:hAnsi="Century Gothic" w:cs="Times New Roman"/>
+                          <w:sz w:val="28"/>
+                          <w:szCs w:val="28"/>
+                        </w:rPr>
+                        <w:br/>
+                        <w:t xml:space="preserve">Lien : </w:t>
+                      </w:r>
+                      <w:hyperlink r:id="rId15" w:history="1">
+                        <w:r>
+                          <w:rPr>
+                            <w:rStyle w:val="Lienhypertexte"/>
+                            <w:rFonts w:ascii="Century Gothic" w:hAnsi="Century Gothic"/>
+                            <w:color w:val="C00000"/>
+                            <w:sz w:val="28"/>
+                          </w:rPr>
+                          <w:t>https://chair-rental.vercel.app/</w:t>
+                        </w:r>
+                      </w:hyperlink>
+                    </w:p>
+                    <w:p>
+                      <w:pPr>
+                        <w:pStyle w:val="Paragraphedeliste"/>
+                        <w:numPr>
+                          <w:ilvl w:val="0"/>
+                          <w:numId w:val="6"/>
+                        </w:numPr>
                         <w:spacing w:after="0" w:line="240" w:lineRule="auto"/>
                         <w:ind w:left="80" w:hanging="80"/>
                         <w:rPr>
@@ -3176,7 +3606,6 @@
                           <w:szCs w:val="28"/>
                         </w:rPr>
                       </w:pPr>
-                      <w:proofErr w:type="spellStart"/>
                       <w:r>
                         <w:rPr>
                           <w:rFonts w:ascii="Century Gothic" w:eastAsia="Times New Roman" w:hAnsi="Century Gothic" w:cs="Times New Roman"/>
@@ -3186,9 +3615,9 @@
                           <w:sz w:val="28"/>
                           <w:szCs w:val="28"/>
                         </w:rPr>
-                        <w:t>Generalite</w:t>
-                      </w:r>
-                      <w:proofErr w:type="spellEnd"/>
+                        <w:lastRenderedPageBreak/>
+                        <w:t>Généralité</w:t>
+                      </w:r>
                       <w:r>
                         <w:rPr>
                           <w:rFonts w:ascii="Century Gothic" w:eastAsia="Times New Roman" w:hAnsi="Century Gothic" w:cs="Times New Roman"/>
@@ -3262,14 +3691,44 @@
                           <w:szCs w:val="28"/>
                         </w:rPr>
                         <w:t xml:space="preserve">. </w:t>
+                      </w:r>
+                      <w:r>
+                        <w:rPr>
+                          <w:rFonts w:ascii="Century Gothic" w:eastAsia="Times New Roman" w:hAnsi="Century Gothic" w:cs="Times New Roman"/>
+                          <w:color w:val="000000"/>
+                          <w:sz w:val="28"/>
+                          <w:szCs w:val="28"/>
+                        </w:rPr>
+                        <w:t>(landing page)</w:t>
+                      </w:r>
+                      <w:r>
+                        <w:rPr>
+                          <w:rFonts w:ascii="Century Gothic" w:eastAsia="Times New Roman" w:hAnsi="Century Gothic" w:cs="Times New Roman"/>
+                          <w:color w:val="000000"/>
+                          <w:sz w:val="28"/>
+                          <w:szCs w:val="28"/>
+                        </w:rPr>
+                        <w:br/>
+                        <w:t xml:space="preserve">        - liste des produits</w:t>
+                      </w:r>
+                      <w:r>
+                        <w:rPr>
+                          <w:rFonts w:ascii="Century Gothic" w:eastAsia="Times New Roman" w:hAnsi="Century Gothic" w:cs="Times New Roman"/>
+                          <w:color w:val="000000"/>
+                          <w:sz w:val="28"/>
+                          <w:szCs w:val="28"/>
+                        </w:rPr>
+                        <w:br/>
+                        <w:t xml:space="preserve">        - accueil, vente, contact page</w:t>
                       </w:r>
                     </w:p>
                     <w:p>
                       <w:pPr>
                         <w:spacing w:line="240" w:lineRule="auto"/>
                         <w:rPr>
-                          <w:rFonts w:ascii="Century Gothic" w:eastAsia="Times New Roman" w:hAnsi="Century Gothic" w:cs="Times New Roman"/>
-                          <w:color w:val="000000"/>
+                          <w:rStyle w:val="Lienhypertexte"/>
+                          <w:rFonts w:ascii="Century Gothic" w:eastAsia="Times New Roman" w:hAnsi="Century Gothic" w:cs="Times New Roman"/>
+                          <w:color w:val="C00000"/>
                           <w:sz w:val="28"/>
                           <w:szCs w:val="28"/>
                         </w:rPr>
@@ -3292,7 +3751,7 @@
                         </w:rPr>
                         <w:t xml:space="preserve">Lien : </w:t>
                       </w:r>
-                      <w:hyperlink r:id="rId15" w:history="1">
+                      <w:hyperlink r:id="rId16" w:history="1">
                         <w:r>
                           <w:rPr>
                             <w:rStyle w:val="Lienhypertexte"/>
@@ -3310,6 +3769,233 @@
                         <w:pStyle w:val="Paragraphedeliste"/>
                         <w:numPr>
                           <w:ilvl w:val="0"/>
+                          <w:numId w:val="10"/>
+                        </w:numPr>
+                        <w:spacing w:line="240" w:lineRule="auto"/>
+                        <w:ind w:left="346" w:hanging="205"/>
+                        <w:jc w:val="both"/>
+                        <w:rPr>
+                          <w:rFonts w:ascii="Century Gothic" w:eastAsia="Times New Roman" w:hAnsi="Century Gothic" w:cs="Times New Roman"/>
+                          <w:color w:val="C00000"/>
+                          <w:sz w:val="28"/>
+                          <w:szCs w:val="28"/>
+                          <w:u w:val="single"/>
+                        </w:rPr>
+                      </w:pPr>
+                      <w:r>
+                        <w:rPr>
+                          <w:rFonts w:ascii="Century Gothic" w:eastAsia="Times New Roman" w:hAnsi="Century Gothic" w:cs="Times New Roman"/>
+                          <w:color w:val="C00000"/>
+                          <w:sz w:val="28"/>
+                          <w:szCs w:val="28"/>
+                        </w:rPr>
+                        <w:t xml:space="preserve"> </w:t>
+                      </w:r>
+                      <w:proofErr w:type="spellStart"/>
+                      <w:r>
+                        <w:rPr>
+                          <w:rFonts w:ascii="Century Gothic" w:eastAsia="Times New Roman" w:hAnsi="Century Gothic" w:cs="Times New Roman"/>
+                          <w:b/>
+                          <w:color w:val="C00000"/>
+                          <w:sz w:val="28"/>
+                          <w:szCs w:val="28"/>
+                        </w:rPr>
+                        <w:t>Woconnex</w:t>
+                      </w:r>
+                      <w:proofErr w:type="spellEnd"/>
+                      <w:r>
+                        <w:rPr>
+                          <w:rFonts w:ascii="Century Gothic" w:eastAsia="Times New Roman" w:hAnsi="Century Gothic" w:cs="Times New Roman"/>
+                          <w:b/>
+                          <w:color w:val="C00000"/>
+                          <w:sz w:val="28"/>
+                          <w:szCs w:val="28"/>
+                        </w:rPr>
+                        <w:t xml:space="preserve"> : </w:t>
+                      </w:r>
+                      <w:r>
+                        <w:rPr>
+                          <w:rFonts w:ascii="Century Gothic" w:eastAsia="Times New Roman" w:hAnsi="Century Gothic" w:cs="Times New Roman"/>
+                          <w:sz w:val="28"/>
+                          <w:szCs w:val="28"/>
+                        </w:rPr>
+                        <w:t>un projet</w:t>
+                      </w:r>
+                      <w:r>
+                        <w:rPr>
+                          <w:rFonts w:ascii="Century Gothic" w:eastAsia="Times New Roman" w:hAnsi="Century Gothic" w:cs="Times New Roman"/>
+                          <w:sz w:val="28"/>
+                          <w:szCs w:val="28"/>
+                        </w:rPr>
+                        <w:t xml:space="preserve"> (en cours)</w:t>
+                      </w:r>
+                      <w:r>
+                        <w:rPr>
+                          <w:rFonts w:ascii="Century Gothic" w:eastAsia="Times New Roman" w:hAnsi="Century Gothic" w:cs="Times New Roman"/>
+                          <w:sz w:val="28"/>
+                          <w:szCs w:val="28"/>
+                        </w:rPr>
+                        <w:t xml:space="preserve"> développé lors </w:t>
+                      </w:r>
+                      <w:r>
+                        <w:rPr>
+                          <w:rFonts w:ascii="Century Gothic" w:eastAsia="Times New Roman" w:hAnsi="Century Gothic" w:cs="Times New Roman"/>
+                          <w:sz w:val="28"/>
+                          <w:szCs w:val="28"/>
+                        </w:rPr>
+                        <w:t xml:space="preserve">d’un </w:t>
+                      </w:r>
+                      <w:proofErr w:type="spellStart"/>
+                      <w:r>
+                        <w:rPr>
+                          <w:rFonts w:ascii="Century Gothic" w:eastAsia="Times New Roman" w:hAnsi="Century Gothic" w:cs="Times New Roman"/>
+                          <w:sz w:val="28"/>
+                          <w:szCs w:val="28"/>
+                        </w:rPr>
+                        <w:t>hackathon</w:t>
+                      </w:r>
+                      <w:proofErr w:type="spellEnd"/>
+                      <w:r>
+                        <w:rPr>
+                          <w:rFonts w:ascii="Century Gothic" w:eastAsia="Times New Roman" w:hAnsi="Century Gothic" w:cs="Times New Roman"/>
+                          <w:sz w:val="28"/>
+                          <w:szCs w:val="28"/>
+                        </w:rPr>
+                        <w:t xml:space="preserve"> organisé par le </w:t>
+                      </w:r>
+                      <w:r>
+                        <w:rPr>
+                          <w:rFonts w:ascii="Century Gothic" w:eastAsia="Times New Roman" w:hAnsi="Century Gothic" w:cs="Times New Roman"/>
+                          <w:b/>
+                          <w:color w:val="C00000"/>
+                          <w:sz w:val="28"/>
+                          <w:szCs w:val="28"/>
+                        </w:rPr>
+                        <w:t>CITS</w:t>
+                      </w:r>
+                      <w:r>
+                        <w:rPr>
+                          <w:rFonts w:ascii="Century Gothic" w:eastAsia="Times New Roman" w:hAnsi="Century Gothic" w:cs="Times New Roman"/>
+                          <w:color w:val="C00000"/>
+                          <w:sz w:val="28"/>
+                          <w:szCs w:val="28"/>
+                        </w:rPr>
+                        <w:t xml:space="preserve"> </w:t>
+                      </w:r>
+                      <w:r>
+                        <w:rPr>
+                          <w:rFonts w:ascii="Century Gothic" w:eastAsia="Times New Roman" w:hAnsi="Century Gothic" w:cs="Times New Roman"/>
+                          <w:sz w:val="28"/>
+                          <w:szCs w:val="28"/>
+                        </w:rPr>
+                        <w:t xml:space="preserve">déroulé en octobre 2024 sous le </w:t>
+                      </w:r>
+                      <w:r>
+                        <w:rPr>
+                          <w:rFonts w:ascii="Century Gothic" w:eastAsia="Times New Roman" w:hAnsi="Century Gothic" w:cs="Times New Roman"/>
+                          <w:b/>
+                          <w:sz w:val="28"/>
+                          <w:szCs w:val="28"/>
+                        </w:rPr>
+                        <w:t>thè</w:t>
+                      </w:r>
+                      <w:r>
+                        <w:rPr>
+                          <w:rFonts w:ascii="Century Gothic" w:eastAsia="Times New Roman" w:hAnsi="Century Gothic" w:cs="Times New Roman"/>
+                          <w:b/>
+                          <w:sz w:val="28"/>
+                          <w:szCs w:val="28"/>
+                        </w:rPr>
+                        <w:t>me</w:t>
+                      </w:r>
+                      <w:r>
+                        <w:rPr>
+                          <w:rFonts w:ascii="Century Gothic" w:eastAsia="Times New Roman" w:hAnsi="Century Gothic" w:cs="Times New Roman"/>
+                          <w:sz w:val="28"/>
+                          <w:szCs w:val="28"/>
+                        </w:rPr>
+                        <w:t> : &lt;&lt;disparité de genre féminine dans les secteurs technologi</w:t>
+                      </w:r>
+                      <w:r>
+                        <w:rPr>
+                          <w:rFonts w:ascii="Century Gothic" w:eastAsia="Times New Roman" w:hAnsi="Century Gothic" w:cs="Times New Roman"/>
+                          <w:sz w:val="28"/>
+                          <w:szCs w:val="28"/>
+                        </w:rPr>
+                        <w:t xml:space="preserve">que &gt;&gt; le projet consistait </w:t>
+                      </w:r>
+                      <w:r>
+                        <w:rPr>
+                          <w:rFonts w:ascii="Century Gothic" w:eastAsia="Times New Roman" w:hAnsi="Century Gothic" w:cs="Times New Roman"/>
+                          <w:sz w:val="28"/>
+                          <w:szCs w:val="28"/>
+                        </w:rPr>
+                        <w:t>cr</w:t>
+                      </w:r>
+                      <w:r>
+                        <w:rPr>
+                          <w:rFonts w:ascii="Century Gothic" w:eastAsia="Times New Roman" w:hAnsi="Century Gothic" w:cs="Times New Roman"/>
+                          <w:sz w:val="28"/>
+                          <w:szCs w:val="28"/>
+                        </w:rPr>
+                        <w:t xml:space="preserve">ée une plateforme </w:t>
+                      </w:r>
+                      <w:r>
+                        <w:rPr>
+                          <w:rFonts w:ascii="Century Gothic" w:eastAsia="Times New Roman" w:hAnsi="Century Gothic" w:cs="Times New Roman"/>
+                          <w:sz w:val="28"/>
+                          <w:szCs w:val="28"/>
+                        </w:rPr>
+                        <w:t xml:space="preserve">pour répondre à cette problématique </w:t>
+                      </w:r>
+                      <w:r>
+                        <w:rPr>
+                          <w:rFonts w:ascii="Century Gothic" w:eastAsia="Times New Roman" w:hAnsi="Century Gothic" w:cs="Times New Roman"/>
+                          <w:sz w:val="28"/>
+                          <w:szCs w:val="28"/>
+                        </w:rPr>
+                        <w:br/>
+                        <w:t xml:space="preserve">   Lien : </w:t>
+                      </w:r>
+                      <w:hyperlink r:id="rId17" w:history="1">
+                        <w:r>
+                          <w:rPr>
+                            <w:rStyle w:val="Lienhypertexte"/>
+                            <w:rFonts w:ascii="Century Gothic" w:eastAsia="Times New Roman" w:hAnsi="Century Gothic" w:cs="Times New Roman"/>
+                            <w:color w:val="C00000"/>
+                            <w:sz w:val="28"/>
+                            <w:szCs w:val="28"/>
+                          </w:rPr>
+                          <w:t>https://woconnex.vercel.app/dashboard</w:t>
+                        </w:r>
+                      </w:hyperlink>
+                    </w:p>
+                    <w:p>
+                      <w:pPr>
+                        <w:pStyle w:val="Paragraphedeliste"/>
+                        <w:numPr>
+                          <w:ilvl w:val="0"/>
+                          <w:numId w:val="10"/>
+                        </w:numPr>
+                        <w:spacing w:line="240" w:lineRule="auto"/>
+                        <w:ind w:left="346" w:hanging="346"/>
+                        <w:jc w:val="both"/>
+                        <w:rPr>
+                          <w:rFonts w:ascii="Century Gothic" w:eastAsia="Times New Roman" w:hAnsi="Century Gothic" w:cs="Times New Roman"/>
+                          <w:color w:val="C00000"/>
+                          <w:sz w:val="28"/>
+                          <w:szCs w:val="28"/>
+                          <w:u w:val="single"/>
+                        </w:rPr>
+                      </w:pPr>
+                      <w:bookmarkStart w:id="0" w:name="_GoBack"/>
+                      <w:bookmarkEnd w:id="0"/>
+                    </w:p>
+                    <w:p>
+                      <w:pPr>
+                        <w:pStyle w:val="Paragraphedeliste"/>
+                        <w:numPr>
+                          <w:ilvl w:val="0"/>
                           <w:numId w:val="6"/>
                         </w:numPr>
                         <w:spacing w:after="0" w:line="240" w:lineRule="auto"/>
@@ -3377,8 +4063,9 @@
                       <w:pPr>
                         <w:spacing w:after="0" w:line="240" w:lineRule="auto"/>
                         <w:rPr>
-                          <w:rFonts w:ascii="Century Gothic" w:eastAsia="Times New Roman" w:hAnsi="Century Gothic" w:cs="Times New Roman"/>
-                          <w:color w:val="000000"/>
+                          <w:rStyle w:val="Lienhypertexte"/>
+                          <w:rFonts w:ascii="Century Gothic" w:eastAsia="Times New Roman" w:hAnsi="Century Gothic" w:cs="Times New Roman"/>
+                          <w:color w:val="C00000"/>
                           <w:sz w:val="28"/>
                           <w:szCs w:val="28"/>
                         </w:rPr>
@@ -3401,7 +4088,7 @@
                         </w:rPr>
                         <w:t xml:space="preserve">Lien : </w:t>
                       </w:r>
-                      <w:hyperlink r:id="rId16" w:history="1">
+                      <w:hyperlink r:id="rId18" w:history="1">
                         <w:r>
                           <w:rPr>
                             <w:rStyle w:val="Lienhypertexte"/>
@@ -3418,9 +4105,110 @@
                       <w:pPr>
                         <w:spacing w:after="0" w:line="240" w:lineRule="auto"/>
                         <w:rPr>
+                          <w:rStyle w:val="Lienhypertexte"/>
+                          <w:rFonts w:ascii="Century Gothic" w:eastAsia="Times New Roman" w:hAnsi="Century Gothic" w:cs="Times New Roman"/>
+                          <w:color w:val="C00000"/>
+                          <w:sz w:val="28"/>
+                          <w:szCs w:val="28"/>
+                        </w:rPr>
+                      </w:pPr>
+                    </w:p>
+                    <w:p>
+                      <w:pPr>
+                        <w:spacing w:after="0" w:line="240" w:lineRule="auto"/>
+                        <w:rPr>
+                          <w:rStyle w:val="Lienhypertexte"/>
+                          <w:rFonts w:ascii="Century Gothic" w:eastAsia="Times New Roman" w:hAnsi="Century Gothic" w:cs="Times New Roman"/>
+                          <w:color w:val="C00000"/>
+                          <w:sz w:val="28"/>
+                          <w:szCs w:val="28"/>
+                        </w:rPr>
+                      </w:pPr>
+                    </w:p>
+                    <w:p>
+                      <w:pPr>
+                        <w:spacing w:after="0" w:line="240" w:lineRule="auto"/>
+                        <w:rPr>
+                          <w:rStyle w:val="Lienhypertexte"/>
+                          <w:rFonts w:ascii="Century Gothic" w:eastAsia="Times New Roman" w:hAnsi="Century Gothic" w:cs="Times New Roman"/>
+                          <w:color w:val="C00000"/>
+                          <w:sz w:val="28"/>
+                          <w:szCs w:val="28"/>
+                        </w:rPr>
+                      </w:pPr>
+                    </w:p>
+                    <w:p>
+                      <w:pPr>
+                        <w:spacing w:after="0" w:line="240" w:lineRule="auto"/>
+                        <w:rPr>
+                          <w:rStyle w:val="Lienhypertexte"/>
+                          <w:rFonts w:ascii="Century Gothic" w:eastAsia="Times New Roman" w:hAnsi="Century Gothic" w:cs="Times New Roman"/>
+                          <w:color w:val="C00000"/>
+                          <w:sz w:val="28"/>
+                          <w:szCs w:val="28"/>
+                        </w:rPr>
+                      </w:pPr>
+                    </w:p>
+                    <w:p>
+                      <w:pPr>
+                        <w:spacing w:after="0" w:line="240" w:lineRule="auto"/>
+                        <w:rPr>
+                          <w:rStyle w:val="Lienhypertexte"/>
+                          <w:rFonts w:ascii="Century Gothic" w:eastAsia="Times New Roman" w:hAnsi="Century Gothic" w:cs="Times New Roman"/>
+                          <w:color w:val="C00000"/>
+                          <w:sz w:val="28"/>
+                          <w:szCs w:val="28"/>
+                        </w:rPr>
+                      </w:pPr>
+                    </w:p>
+                    <w:p>
+                      <w:pPr>
+                        <w:spacing w:after="0" w:line="240" w:lineRule="auto"/>
+                        <w:rPr>
+                          <w:rFonts w:ascii="Century Gothic" w:eastAsia="Times New Roman" w:hAnsi="Century Gothic" w:cs="Times New Roman"/>
+                          <w:color w:val="000000"/>
+                          <w:sz w:val="28"/>
+                          <w:szCs w:val="28"/>
+                        </w:rPr>
+                      </w:pPr>
+                    </w:p>
+                    <w:p>
+                      <w:pPr>
+                        <w:spacing w:after="0" w:line="240" w:lineRule="auto"/>
+                        <w:rPr>
                           <w:rFonts w:ascii="Times New Roman" w:eastAsia="Times New Roman" w:hAnsi="Times New Roman" w:cs="Times New Roman"/>
                           <w:sz w:val="24"/>
                           <w:szCs w:val="24"/>
+                        </w:rPr>
+                      </w:pPr>
+                    </w:p>
+                  </w:tc>
+                </w:tr>
+                <w:tr>
+                  <w:trPr>
+                    <w:trHeight w:val="1664"/>
+                  </w:trPr>
+                  <w:tc>
+                    <w:tcPr>
+                      <w:tcW w:w="9771" w:type="dxa"/>
+                      <w:tcBorders>
+                        <w:top w:val="nil"/>
+                        <w:left w:val="nil"/>
+                        <w:bottom w:val="nil"/>
+                        <w:right w:val="nil"/>
+                      </w:tcBorders>
+                      <w:vAlign w:val="center"/>
+                    </w:tcPr>
+                    <w:p>
+                      <w:pPr>
+                        <w:spacing w:after="0" w:line="240" w:lineRule="auto"/>
+                        <w:rPr>
+                          <w:rFonts w:ascii="Century Gothic" w:eastAsia="Times New Roman" w:hAnsi="Century Gothic" w:cs="Times New Roman"/>
+                          <w:b/>
+                          <w:bCs/>
+                          <w:color w:val="C00000"/>
+                          <w:sz w:val="28"/>
+                          <w:szCs w:val="28"/>
                         </w:rPr>
                       </w:pPr>
                     </w:p>
@@ -3448,19 +4236,20 @@
               <w:noProof/>
               <w:kern w:val="28"/>
             </w:rPr>
+            <w:lastRenderedPageBreak/>
             <mc:AlternateContent>
               <mc:Choice Requires="wps">
                 <w:drawing>
-                  <wp:anchor distT="0" distB="0" distL="114300" distR="114300" simplePos="0" relativeHeight="251675648" behindDoc="0" locked="0" layoutInCell="1" allowOverlap="1" wp14:anchorId="676FB0E3" wp14:editId="68955A29">
+                  <wp:anchor distT="0" distB="0" distL="114300" distR="114300" simplePos="0" relativeHeight="251675648" behindDoc="0" locked="0" layoutInCell="1" allowOverlap="1" wp14:anchorId="676FB0E3" wp14:editId="1C13A140">
                     <wp:simplePos x="0" y="0"/>
                     <wp:positionH relativeFrom="page">
-                      <wp:posOffset>-95250</wp:posOffset>
+                      <wp:posOffset>152400</wp:posOffset>
                     </wp:positionH>
                     <wp:positionV relativeFrom="paragraph">
-                      <wp:posOffset>278130</wp:posOffset>
+                      <wp:posOffset>1803400</wp:posOffset>
                     </wp:positionV>
-                    <wp:extent cx="7715250" cy="1914525"/>
-                    <wp:effectExtent l="0" t="0" r="0" b="9525"/>
+                    <wp:extent cx="7715250" cy="1981200"/>
+                    <wp:effectExtent l="0" t="0" r="0" b="0"/>
                     <wp:wrapNone/>
                     <wp:docPr id="2" name="Rectangle 2"/>
                     <wp:cNvGraphicFramePr/>
@@ -3471,7 +4260,7 @@
                           <wps:spPr>
                             <a:xfrm>
                               <a:off x="0" y="0"/>
-                              <a:ext cx="7715250" cy="1914525"/>
+                              <a:ext cx="7715250" cy="1981200"/>
                             </a:xfrm>
                             <a:prstGeom prst="rect">
                               <a:avLst/>
@@ -3512,7 +4301,6 @@
                                     <w:szCs w:val="28"/>
                                   </w:rPr>
                                 </w:pPr>
-                                <w:bookmarkStart w:id="0" w:name="_GoBack"/>
                               </w:p>
                               <w:p>
                                 <w:pPr>
@@ -3544,7 +4332,7 @@
                                     <w:kern w:val="28"/>
                                   </w:rPr>
                                 </w:pPr>
-                                <w:hyperlink r:id="rId17" w:history="1">
+                                <w:hyperlink r:id="rId19" w:history="1">
                                   <w:r>
                                     <w:rPr>
                                       <w:rStyle w:val="Lienhypertexte"/>
@@ -3553,11 +4341,10 @@
                                       <w:sz w:val="28"/>
                                       <w:szCs w:val="28"/>
                                     </w:rPr>
-                                    <w:t>https://bachdev.vercel.app/project</w:t>
+                                    <w:t>https://bachdev.vercel.app/projects</w:t>
                                   </w:r>
                                 </w:hyperlink>
                               </w:p>
-                              <w:bookmarkEnd w:id="0"/>
                               <w:p>
                                 <w:pPr>
                                   <w:jc w:val="center"/>
@@ -3585,7 +4372,7 @@
               </mc:Choice>
               <mc:Fallback>
                 <w:pict>
-                  <v:rect w14:anchorId="676FB0E3" id="Rectangle 2" o:spid="_x0000_s1028" style="position:absolute;margin-left:-7.5pt;margin-top:21.9pt;width:607.5pt;height:150.75pt;z-index:251675648;visibility:visible;mso-wrap-style:square;mso-width-percent:0;mso-height-percent:0;mso-wrap-distance-left:9pt;mso-wrap-distance-top:0;mso-wrap-distance-right:9pt;mso-wrap-distance-bottom:0;mso-position-horizontal:absolute;mso-position-horizontal-relative:page;mso-position-vertical:absolute;mso-position-vertical-relative:text;mso-width-percent:0;mso-height-percent:0;mso-width-relative:margin;mso-height-relative:margin;v-text-anchor:middle" o:gfxdata="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" fillcolor="#c00000" stroked="f" strokeweight="2.25pt">
+                  <v:rect w14:anchorId="676FB0E3" id="Rectangle 2" o:spid="_x0000_s1028" style="position:absolute;margin-left:12pt;margin-top:142pt;width:607.5pt;height:156pt;z-index:251675648;visibility:visible;mso-wrap-style:square;mso-width-percent:0;mso-height-percent:0;mso-wrap-distance-left:9pt;mso-wrap-distance-top:0;mso-wrap-distance-right:9pt;mso-wrap-distance-bottom:0;mso-position-horizontal:absolute;mso-position-horizontal-relative:page;mso-position-vertical:absolute;mso-position-vertical-relative:text;mso-width-percent:0;mso-height-percent:0;mso-width-relative:margin;mso-height-relative:margin;v-text-anchor:middle" o:gfxdata="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" fillcolor="#c00000" stroked="f" strokeweight="2.25pt">
                     <v:textbox>
                       <w:txbxContent>
                         <w:p>
@@ -3599,7 +4386,6 @@
                               <w:szCs w:val="28"/>
                             </w:rPr>
                           </w:pPr>
-                          <w:bookmarkStart w:id="1" w:name="_GoBack"/>
                         </w:p>
                         <w:p>
                           <w:pPr>
@@ -3631,7 +4417,7 @@
                               <w:kern w:val="28"/>
                             </w:rPr>
                           </w:pPr>
-                          <w:hyperlink r:id="rId18" w:history="1">
+                          <w:hyperlink r:id="rId20" w:history="1">
                             <w:r>
                               <w:rPr>
                                 <w:rStyle w:val="Lienhypertexte"/>
@@ -3640,11 +4426,10 @@
                                 <w:sz w:val="28"/>
                                 <w:szCs w:val="28"/>
                               </w:rPr>
-                              <w:t>https://bachdev.vercel.app/project</w:t>
+                              <w:t>https://bachdev.vercel.app/projects</w:t>
                             </w:r>
                           </w:hyperlink>
                         </w:p>
-                        <w:bookmarkEnd w:id="1"/>
                         <w:p>
                           <w:pPr>
                             <w:jc w:val="center"/>
@@ -3662,7 +4447,7 @@
       </w:sdtContent>
     </w:sdt>
     <w:sectPr>
-      <w:footerReference w:type="default" r:id="rId19"/>
+      <w:footerReference w:type="default" r:id="rId21"/>
       <w:pgSz w:w="11907" w:h="16839"/>
       <w:pgMar w:top="1148" w:right="1050" w:bottom="1148" w:left="1050" w:header="709" w:footer="709" w:gutter="0"/>
       <w:pgNumType w:start="0"/>
@@ -3956,6 +4741,119 @@
     </w:lvl>
   </w:abstractNum>
   <w:abstractNum w:abstractNumId="1">
+    <w:nsid w:val="0BEF00DC"/>
+    <w:multiLevelType w:val="hybridMultilevel"/>
+    <w:tmpl w:val="32323938"/>
+    <w:lvl w:ilvl="0" w:tplc="040C000D">
+      <w:start w:val="1"/>
+      <w:numFmt w:val="bullet"/>
+      <w:lvlText w:val=""/>
+      <w:lvlJc w:val="left"/>
+      <w:pPr>
+        <w:ind w:left="720" w:hanging="360"/>
+      </w:pPr>
+      <w:rPr>
+        <w:rFonts w:ascii="Wingdings" w:hAnsi="Wingdings" w:hint="default"/>
+      </w:rPr>
+    </w:lvl>
+    <w:lvl w:ilvl="1" w:tplc="040C0003" w:tentative="1">
+      <w:start w:val="1"/>
+      <w:numFmt w:val="bullet"/>
+      <w:lvlText w:val="o"/>
+      <w:lvlJc w:val="left"/>
+      <w:pPr>
+        <w:ind w:left="1440" w:hanging="360"/>
+      </w:pPr>
+      <w:rPr>
+        <w:rFonts w:ascii="Courier New" w:hAnsi="Courier New" w:cs="Courier New" w:hint="default"/>
+      </w:rPr>
+    </w:lvl>
+    <w:lvl w:ilvl="2" w:tplc="040C0005" w:tentative="1">
+      <w:start w:val="1"/>
+      <w:numFmt w:val="bullet"/>
+      <w:lvlText w:val=""/>
+      <w:lvlJc w:val="left"/>
+      <w:pPr>
+        <w:ind w:left="2160" w:hanging="360"/>
+      </w:pPr>
+      <w:rPr>
+        <w:rFonts w:ascii="Wingdings" w:hAnsi="Wingdings" w:hint="default"/>
+      </w:rPr>
+    </w:lvl>
+    <w:lvl w:ilvl="3" w:tplc="040C0001" w:tentative="1">
+      <w:start w:val="1"/>
+      <w:numFmt w:val="bullet"/>
+      <w:lvlText w:val=""/>
+      <w:lvlJc w:val="left"/>
+      <w:pPr>
+        <w:ind w:left="2880" w:hanging="360"/>
+      </w:pPr>
+      <w:rPr>
+        <w:rFonts w:ascii="Symbol" w:hAnsi="Symbol" w:hint="default"/>
+      </w:rPr>
+    </w:lvl>
+    <w:lvl w:ilvl="4" w:tplc="040C0003" w:tentative="1">
+      <w:start w:val="1"/>
+      <w:numFmt w:val="bullet"/>
+      <w:lvlText w:val="o"/>
+      <w:lvlJc w:val="left"/>
+      <w:pPr>
+        <w:ind w:left="3600" w:hanging="360"/>
+      </w:pPr>
+      <w:rPr>
+        <w:rFonts w:ascii="Courier New" w:hAnsi="Courier New" w:cs="Courier New" w:hint="default"/>
+      </w:rPr>
+    </w:lvl>
+    <w:lvl w:ilvl="5" w:tplc="040C0005" w:tentative="1">
+      <w:start w:val="1"/>
+      <w:numFmt w:val="bullet"/>
+      <w:lvlText w:val=""/>
+      <w:lvlJc w:val="left"/>
+      <w:pPr>
+        <w:ind w:left="4320" w:hanging="360"/>
+      </w:pPr>
+      <w:rPr>
+        <w:rFonts w:ascii="Wingdings" w:hAnsi="Wingdings" w:hint="default"/>
+      </w:rPr>
+    </w:lvl>
+    <w:lvl w:ilvl="6" w:tplc="040C0001" w:tentative="1">
+      <w:start w:val="1"/>
+      <w:numFmt w:val="bullet"/>
+      <w:lvlText w:val=""/>
+      <w:lvlJc w:val="left"/>
+      <w:pPr>
+        <w:ind w:left="5040" w:hanging="360"/>
+      </w:pPr>
+      <w:rPr>
+        <w:rFonts w:ascii="Symbol" w:hAnsi="Symbol" w:hint="default"/>
+      </w:rPr>
+    </w:lvl>
+    <w:lvl w:ilvl="7" w:tplc="040C0003" w:tentative="1">
+      <w:start w:val="1"/>
+      <w:numFmt w:val="bullet"/>
+      <w:lvlText w:val="o"/>
+      <w:lvlJc w:val="left"/>
+      <w:pPr>
+        <w:ind w:left="5760" w:hanging="360"/>
+      </w:pPr>
+      <w:rPr>
+        <w:rFonts w:ascii="Courier New" w:hAnsi="Courier New" w:cs="Courier New" w:hint="default"/>
+      </w:rPr>
+    </w:lvl>
+    <w:lvl w:ilvl="8" w:tplc="040C0005" w:tentative="1">
+      <w:start w:val="1"/>
+      <w:numFmt w:val="bullet"/>
+      <w:lvlText w:val=""/>
+      <w:lvlJc w:val="left"/>
+      <w:pPr>
+        <w:ind w:left="6480" w:hanging="360"/>
+      </w:pPr>
+      <w:rPr>
+        <w:rFonts w:ascii="Wingdings" w:hAnsi="Wingdings" w:hint="default"/>
+      </w:rPr>
+    </w:lvl>
+  </w:abstractNum>
+  <w:abstractNum w:abstractNumId="2">
     <w:nsid w:val="38F37050"/>
     <w:multiLevelType w:val="hybridMultilevel"/>
     <w:tmpl w:val="E40087FE"/>
@@ -4068,7 +4966,121 @@
       </w:rPr>
     </w:lvl>
   </w:abstractNum>
-  <w:abstractNum w:abstractNumId="2">
+  <w:abstractNum w:abstractNumId="3">
+    <w:nsid w:val="3A97649D"/>
+    <w:multiLevelType w:val="hybridMultilevel"/>
+    <w:tmpl w:val="AE348DC0"/>
+    <w:lvl w:ilvl="0" w:tplc="29C6D9D0">
+      <w:numFmt w:val="bullet"/>
+      <w:lvlText w:val="-"/>
+      <w:lvlJc w:val="left"/>
+      <w:pPr>
+        <w:ind w:left="440" w:hanging="360"/>
+      </w:pPr>
+      <w:rPr>
+        <w:rFonts w:ascii="Century Gothic" w:eastAsia="Times New Roman" w:hAnsi="Century Gothic" w:cs="Times New Roman" w:hint="default"/>
+        <w:b/>
+        <w:color w:val="C00000"/>
+      </w:rPr>
+    </w:lvl>
+    <w:lvl w:ilvl="1" w:tplc="040C0003" w:tentative="1">
+      <w:start w:val="1"/>
+      <w:numFmt w:val="bullet"/>
+      <w:lvlText w:val="o"/>
+      <w:lvlJc w:val="left"/>
+      <w:pPr>
+        <w:ind w:left="1160" w:hanging="360"/>
+      </w:pPr>
+      <w:rPr>
+        <w:rFonts w:ascii="Courier New" w:hAnsi="Courier New" w:cs="Courier New" w:hint="default"/>
+      </w:rPr>
+    </w:lvl>
+    <w:lvl w:ilvl="2" w:tplc="040C0005" w:tentative="1">
+      <w:start w:val="1"/>
+      <w:numFmt w:val="bullet"/>
+      <w:lvlText w:val=""/>
+      <w:lvlJc w:val="left"/>
+      <w:pPr>
+        <w:ind w:left="1880" w:hanging="360"/>
+      </w:pPr>
+      <w:rPr>
+        <w:rFonts w:ascii="Wingdings" w:hAnsi="Wingdings" w:hint="default"/>
+      </w:rPr>
+    </w:lvl>
+    <w:lvl w:ilvl="3" w:tplc="040C0001" w:tentative="1">
+      <w:start w:val="1"/>
+      <w:numFmt w:val="bullet"/>
+      <w:lvlText w:val=""/>
+      <w:lvlJc w:val="left"/>
+      <w:pPr>
+        <w:ind w:left="2600" w:hanging="360"/>
+      </w:pPr>
+      <w:rPr>
+        <w:rFonts w:ascii="Symbol" w:hAnsi="Symbol" w:hint="default"/>
+      </w:rPr>
+    </w:lvl>
+    <w:lvl w:ilvl="4" w:tplc="040C0003" w:tentative="1">
+      <w:start w:val="1"/>
+      <w:numFmt w:val="bullet"/>
+      <w:lvlText w:val="o"/>
+      <w:lvlJc w:val="left"/>
+      <w:pPr>
+        <w:ind w:left="3320" w:hanging="360"/>
+      </w:pPr>
+      <w:rPr>
+        <w:rFonts w:ascii="Courier New" w:hAnsi="Courier New" w:cs="Courier New" w:hint="default"/>
+      </w:rPr>
+    </w:lvl>
+    <w:lvl w:ilvl="5" w:tplc="040C0005" w:tentative="1">
+      <w:start w:val="1"/>
+      <w:numFmt w:val="bullet"/>
+      <w:lvlText w:val=""/>
+      <w:lvlJc w:val="left"/>
+      <w:pPr>
+        <w:ind w:left="4040" w:hanging="360"/>
+      </w:pPr>
+      <w:rPr>
+        <w:rFonts w:ascii="Wingdings" w:hAnsi="Wingdings" w:hint="default"/>
+      </w:rPr>
+    </w:lvl>
+    <w:lvl w:ilvl="6" w:tplc="040C0001" w:tentative="1">
+      <w:start w:val="1"/>
+      <w:numFmt w:val="bullet"/>
+      <w:lvlText w:val=""/>
+      <w:lvlJc w:val="left"/>
+      <w:pPr>
+        <w:ind w:left="4760" w:hanging="360"/>
+      </w:pPr>
+      <w:rPr>
+        <w:rFonts w:ascii="Symbol" w:hAnsi="Symbol" w:hint="default"/>
+      </w:rPr>
+    </w:lvl>
+    <w:lvl w:ilvl="7" w:tplc="040C0003" w:tentative="1">
+      <w:start w:val="1"/>
+      <w:numFmt w:val="bullet"/>
+      <w:lvlText w:val="o"/>
+      <w:lvlJc w:val="left"/>
+      <w:pPr>
+        <w:ind w:left="5480" w:hanging="360"/>
+      </w:pPr>
+      <w:rPr>
+        <w:rFonts w:ascii="Courier New" w:hAnsi="Courier New" w:cs="Courier New" w:hint="default"/>
+      </w:rPr>
+    </w:lvl>
+    <w:lvl w:ilvl="8" w:tplc="040C0005" w:tentative="1">
+      <w:start w:val="1"/>
+      <w:numFmt w:val="bullet"/>
+      <w:lvlText w:val=""/>
+      <w:lvlJc w:val="left"/>
+      <w:pPr>
+        <w:ind w:left="6200" w:hanging="360"/>
+      </w:pPr>
+      <w:rPr>
+        <w:rFonts w:ascii="Wingdings" w:hAnsi="Wingdings" w:hint="default"/>
+      </w:rPr>
+    </w:lvl>
+  </w:abstractNum>
+  <w:abstractNum w:abstractNumId="4">
     <w:nsid w:val="3B282D00"/>
     <w:multiLevelType w:val="hybridMultilevel"/>
     <w:tmpl w:val="492C6DEC"/>
@@ -4181,7 +5193,120 @@
       </w:rPr>
     </w:lvl>
   </w:abstractNum>
-  <w:abstractNum w:abstractNumId="3">
+  <w:abstractNum w:abstractNumId="5">
+    <w:nsid w:val="40095C95"/>
+    <w:multiLevelType w:val="hybridMultilevel"/>
+    <w:tmpl w:val="E17ACB24"/>
+    <w:lvl w:ilvl="0" w:tplc="E32248EC">
+      <w:numFmt w:val="bullet"/>
+      <w:lvlText w:val="-"/>
+      <w:lvlJc w:val="left"/>
+      <w:pPr>
+        <w:ind w:left="995" w:hanging="360"/>
+      </w:pPr>
+      <w:rPr>
+        <w:rFonts w:ascii="Century Gothic" w:eastAsia="Times New Roman" w:hAnsi="Century Gothic" w:cs="Times New Roman" w:hint="default"/>
+        <w:b/>
+      </w:rPr>
+    </w:lvl>
+    <w:lvl w:ilvl="1" w:tplc="040C0003" w:tentative="1">
+      <w:start w:val="1"/>
+      <w:numFmt w:val="bullet"/>
+      <w:lvlText w:val="o"/>
+      <w:lvlJc w:val="left"/>
+      <w:pPr>
+        <w:ind w:left="1715" w:hanging="360"/>
+      </w:pPr>
+      <w:rPr>
+        <w:rFonts w:ascii="Courier New" w:hAnsi="Courier New" w:cs="Courier New" w:hint="default"/>
+      </w:rPr>
+    </w:lvl>
+    <w:lvl w:ilvl="2" w:tplc="040C0005" w:tentative="1">
+      <w:start w:val="1"/>
+      <w:numFmt w:val="bullet"/>
+      <w:lvlText w:val=""/>
+      <w:lvlJc w:val="left"/>
+      <w:pPr>
+        <w:ind w:left="2435" w:hanging="360"/>
+      </w:pPr>
+      <w:rPr>
+        <w:rFonts w:ascii="Wingdings" w:hAnsi="Wingdings" w:hint="default"/>
+      </w:rPr>
+    </w:lvl>
+    <w:lvl w:ilvl="3" w:tplc="040C0001" w:tentative="1">
+      <w:start w:val="1"/>
+      <w:numFmt w:val="bullet"/>
+      <w:lvlText w:val=""/>
+      <w:lvlJc w:val="left"/>
+      <w:pPr>
+        <w:ind w:left="3155" w:hanging="360"/>
+      </w:pPr>
+      <w:rPr>
+        <w:rFonts w:ascii="Symbol" w:hAnsi="Symbol" w:hint="default"/>
+      </w:rPr>
+    </w:lvl>
+    <w:lvl w:ilvl="4" w:tplc="040C0003" w:tentative="1">
+      <w:start w:val="1"/>
+      <w:numFmt w:val="bullet"/>
+      <w:lvlText w:val="o"/>
+      <w:lvlJc w:val="left"/>
+      <w:pPr>
+        <w:ind w:left="3875" w:hanging="360"/>
+      </w:pPr>
+      <w:rPr>
+        <w:rFonts w:ascii="Courier New" w:hAnsi="Courier New" w:cs="Courier New" w:hint="default"/>
+      </w:rPr>
+    </w:lvl>
+    <w:lvl w:ilvl="5" w:tplc="040C0005" w:tentative="1">
+      <w:start w:val="1"/>
+      <w:numFmt w:val="bullet"/>
+      <w:lvlText w:val=""/>
+      <w:lvlJc w:val="left"/>
+      <w:pPr>
+        <w:ind w:left="4595" w:hanging="360"/>
+      </w:pPr>
+      <w:rPr>
+        <w:rFonts w:ascii="Wingdings" w:hAnsi="Wingdings" w:hint="default"/>
+      </w:rPr>
+    </w:lvl>
+    <w:lvl w:ilvl="6" w:tplc="040C0001" w:tentative="1">
+      <w:start w:val="1"/>
+      <w:numFmt w:val="bullet"/>
+      <w:lvlText w:val=""/>
+      <w:lvlJc w:val="left"/>
+      <w:pPr>
+        <w:ind w:left="5315" w:hanging="360"/>
+      </w:pPr>
+      <w:rPr>
+        <w:rFonts w:ascii="Symbol" w:hAnsi="Symbol" w:hint="default"/>
+      </w:rPr>
+    </w:lvl>
+    <w:lvl w:ilvl="7" w:tplc="040C0003" w:tentative="1">
+      <w:start w:val="1"/>
+      <w:numFmt w:val="bullet"/>
+      <w:lvlText w:val="o"/>
+      <w:lvlJc w:val="left"/>
+      <w:pPr>
+        <w:ind w:left="6035" w:hanging="360"/>
+      </w:pPr>
+      <w:rPr>
+        <w:rFonts w:ascii="Courier New" w:hAnsi="Courier New" w:cs="Courier New" w:hint="default"/>
+      </w:rPr>
+    </w:lvl>
+    <w:lvl w:ilvl="8" w:tplc="040C0005" w:tentative="1">
+      <w:start w:val="1"/>
+      <w:numFmt w:val="bullet"/>
+      <w:lvlText w:val=""/>
+      <w:lvlJc w:val="left"/>
+      <w:pPr>
+        <w:ind w:left="6755" w:hanging="360"/>
+      </w:pPr>
+      <w:rPr>
+        <w:rFonts w:ascii="Wingdings" w:hAnsi="Wingdings" w:hint="default"/>
+      </w:rPr>
+    </w:lvl>
+  </w:abstractNum>
+  <w:abstractNum w:abstractNumId="6">
     <w:nsid w:val="4FB2131F"/>
     <w:multiLevelType w:val="hybridMultilevel"/>
     <w:tmpl w:val="9708AAD2"/>
@@ -4294,10 +5419,10 @@
       </w:rPr>
     </w:lvl>
   </w:abstractNum>
-  <w:abstractNum w:abstractNumId="4">
+  <w:abstractNum w:abstractNumId="7">
     <w:nsid w:val="50267ED1"/>
     <w:multiLevelType w:val="hybridMultilevel"/>
-    <w:tmpl w:val="09D697B8"/>
+    <w:tmpl w:val="812276FC"/>
     <w:lvl w:ilvl="0" w:tplc="040C000D">
       <w:start w:val="1"/>
       <w:numFmt w:val="bullet"/>
@@ -4407,7 +5532,7 @@
       </w:rPr>
     </w:lvl>
   </w:abstractNum>
-  <w:abstractNum w:abstractNumId="5">
+  <w:abstractNum w:abstractNumId="8">
     <w:nsid w:val="5973480D"/>
     <w:multiLevelType w:val="hybridMultilevel"/>
     <w:tmpl w:val="E22E9E84"/>
@@ -4520,7 +5645,7 @@
       </w:rPr>
     </w:lvl>
   </w:abstractNum>
-  <w:abstractNum w:abstractNumId="6">
+  <w:abstractNum w:abstractNumId="9">
     <w:nsid w:val="7F635D04"/>
     <w:multiLevelType w:val="hybridMultilevel"/>
     <w:tmpl w:val="26E2110A"/>
@@ -4636,25 +5761,34 @@
     </w:lvl>
   </w:abstractNum>
   <w:num w:numId="1">
-    <w:abstractNumId w:val="3"/>
+    <w:abstractNumId w:val="6"/>
   </w:num>
   <w:num w:numId="2">
+    <w:abstractNumId w:val="4"/>
+  </w:num>
+  <w:num w:numId="3">
+    <w:abstractNumId w:val="9"/>
+  </w:num>
+  <w:num w:numId="4">
     <w:abstractNumId w:val="2"/>
   </w:num>
-  <w:num w:numId="3">
-    <w:abstractNumId w:val="6"/>
-  </w:num>
-  <w:num w:numId="4">
-    <w:abstractNumId w:val="1"/>
-  </w:num>
   <w:num w:numId="5">
-    <w:abstractNumId w:val="5"/>
+    <w:abstractNumId w:val="8"/>
   </w:num>
   <w:num w:numId="6">
-    <w:abstractNumId w:val="4"/>
+    <w:abstractNumId w:val="7"/>
   </w:num>
   <w:num w:numId="7">
     <w:abstractNumId w:val="0"/>
+  </w:num>
+  <w:num w:numId="8">
+    <w:abstractNumId w:val="3"/>
+  </w:num>
+  <w:num w:numId="9">
+    <w:abstractNumId w:val="5"/>
+  </w:num>
+  <w:num w:numId="10">
+    <w:abstractNumId w:val="1"/>
   </w:num>
 </w:numbering>
 </file>
@@ -6178,7 +7312,7 @@
 </file>
 
 <file path=customXml/itemProps1.xml><?xml version="1.0" encoding="utf-8"?>
-<ds:datastoreItem xmlns:ds="http://schemas.openxmlformats.org/officeDocument/2006/customXml" ds:itemID="{D3016B64-75DB-4BFB-97D7-BDE8048E2C15}">
+<ds:datastoreItem xmlns:ds="http://schemas.openxmlformats.org/officeDocument/2006/customXml" ds:itemID="{81FF5E63-548D-4FD6-BB37-6A9486F6B5F8}">
   <ds:schemaRefs>
     <ds:schemaRef ds:uri="http://schemas.openxmlformats.org/officeDocument/2006/bibliography"/>
   </ds:schemaRefs>

</xml_diff>